<commit_message>
Word-flyer Alkmaar: kaal logo-icoon (naam stond er dubbel op)
Co-Authored-By: Claude Fable 5 <noreply@anthropic.com>
</commit_message>
<xml_diff>
--- a/public/drukwerk/flyer-ALKMAAR2027-bewerkbaar.docx
+++ b/public/drukwerk/flyer-ALKMAAR2027-bewerkbaar.docx
@@ -45,7 +45,7 @@
                 <w:szCs w:val="22"/>
               </w:rPr>
               <w:drawing>
-                <wp:inline distT="0" distB="0" distL="0" distR="0" wp14:anchorId="665101D1" wp14:editId="35DF7AC4">
+                <wp:inline distT="0" distB="0" distL="0" distR="0" wp14:anchorId="3D6F4C2A" wp14:editId="3059F9B7">
                   <wp:extent cx="495300" cy="495300"/>
                   <wp:effectExtent l="0" t="0" r="0" b="0"/>
                   <wp:docPr id="1" name="Afbeelding 1" descr="Leerkwartier-logo"/>
@@ -144,7 +144,7 @@
                 <w:szCs w:val="22"/>
               </w:rPr>
               <w:drawing>
-                <wp:inline distT="0" distB="0" distL="0" distR="0" wp14:anchorId="708058BA" wp14:editId="496EAC94">
+                <wp:inline distT="0" distB="0" distL="0" distR="0" wp14:anchorId="612A79F0" wp14:editId="250E4AD8">
                   <wp:extent cx="1428750" cy="947928"/>
                   <wp:effectExtent l="0" t="0" r="0" b="5080"/>
                   <wp:docPr id="2" name="Afbeelding 2" descr="Logo Voedselbank Alkmaar"/>
@@ -317,7 +317,7 @@
                 <w:szCs w:val="22"/>
               </w:rPr>
               <w:drawing>
-                <wp:inline distT="0" distB="0" distL="0" distR="0" wp14:anchorId="462B6C13" wp14:editId="76056E8A">
+                <wp:inline distT="0" distB="0" distL="0" distR="0" wp14:anchorId="27444ECE" wp14:editId="2F6732A2">
                   <wp:extent cx="1092200" cy="1092200"/>
                   <wp:effectExtent l="0" t="0" r="0" b="0"/>
                   <wp:docPr id="3" name="Afbeelding 3" descr="QR-code naar leerkwartier.app"/>
@@ -441,7 +441,13 @@
               <w:rPr>
                 <w:rFonts w:ascii="Arial" w:hAnsi="Arial" w:cs="Arial"/>
               </w:rPr>
-              <w:t xml:space="preserve"> Tik op de link die verschijnt. De app opent vanzelf. U hoeft niets te installeren. U hoeft geen account te maken.</w:t>
+              <w:t xml:space="preserve"> </w:t>
+            </w:r>
+            <w:r>
+              <w:rPr>
+                <w:rFonts w:ascii="Arial" w:hAnsi="Arial" w:cs="Arial"/>
+              </w:rPr>
+              <w:t>Tik op de link die verschijnt. De app opent vanzelf. U hoeft niets te installeren. U hoeft geen account te maken.</w:t>
             </w:r>
           </w:p>
           <w:p>
@@ -700,13 +706,7 @@
         <w:rPr>
           <w:rFonts w:ascii="Arial" w:hAnsi="Arial" w:cs="Arial"/>
         </w:rPr>
-        <w:t xml:space="preserve"> </w:t>
-      </w:r>
-      <w:r>
-        <w:rPr>
-          <w:rFonts w:ascii="Arial" w:hAnsi="Arial" w:cs="Arial"/>
-        </w:rPr>
-        <w:t>Gratis voor uw gezin, tot en met de toets van 2027. Er gaat nooit zomaar geld af.</w:t>
+        <w:t xml:space="preserve"> Gratis voor uw gezin, tot en met de toets van 2027. Er gaat nooit zomaar geld af.</w:t>
       </w:r>
       <w:r>
         <w:rPr>
@@ -803,7 +803,7 @@
                 <w:szCs w:val="22"/>
               </w:rPr>
               <w:drawing>
-                <wp:inline distT="0" distB="0" distL="0" distR="0" wp14:anchorId="00BD8DF2" wp14:editId="4B5AD0B4">
+                <wp:inline distT="0" distB="0" distL="0" distR="0" wp14:anchorId="66994DAE" wp14:editId="13B8B0E6">
                   <wp:extent cx="901700" cy="947928"/>
                   <wp:effectExtent l="0" t="0" r="0" b="5080"/>
                   <wp:docPr id="4" name="Afbeelding 4" descr="Logo Voedselbank Alkmaar"/>
@@ -892,7 +892,13 @@
               <w:rPr>
                 <w:rFonts w:ascii="Arial" w:hAnsi="Arial" w:cs="Arial"/>
               </w:rPr>
-              <w:t xml:space="preserve"> U krijgt deze flyer van ons. Het aanbod is echt gratis voor u.</w:t>
+              <w:t xml:space="preserve"> </w:t>
+            </w:r>
+            <w:r>
+              <w:rPr>
+                <w:rFonts w:ascii="Arial" w:hAnsi="Arial" w:cs="Arial"/>
+              </w:rPr>
+              <w:t>U krijgt deze flyer van ons. Het aanbod is echt gratis voor u.</w:t>
             </w:r>
           </w:p>
         </w:tc>

</xml_diff>

<commit_message>
Partner-pakket 2.0: alle 11 flyers 1-pagina + bewerkbare Word (v264)
Idee #28 gebouwd: (a) standaard 1-pagina-print-CSS (+ compacte trap voor
langere flyers) in alle flyer-<CODE>.html, PDFs opnieuw gegenereerd en
per stuk op paginateller gecontroleerd; (b) flyer-<CODE>-bewerkbaar.docx
voor alle 11 codes via scripts/maak-partner-pakket.mjs + .ps1 (pwsh);
(c) bonus: 7 oude flyers hadden nog het 🎓-hoedje als logo — vervangen
door het echte Leerkwartier-logo (scripts/fix-hoedje-flyers.mjs).

Co-Authored-By: Claude Fable 5 <noreply@anthropic.com>
</commit_message>
<xml_diff>
--- a/public/drukwerk/flyer-ALKMAAR2027-bewerkbaar.docx
+++ b/public/drukwerk/flyer-ALKMAAR2027-bewerkbaar.docx
@@ -45,7 +45,7 @@
                 <w:szCs w:val="22"/>
               </w:rPr>
               <w:drawing>
-                <wp:inline distT="0" distB="0" distL="0" distR="0" wp14:anchorId="3D6F4C2A" wp14:editId="3059F9B7">
+                <wp:inline distT="0" distB="0" distL="0" distR="0" wp14:anchorId="58D80B95" wp14:editId="0BAC8CCC">
                   <wp:extent cx="495300" cy="495300"/>
                   <wp:effectExtent l="0" t="0" r="0" b="0"/>
                   <wp:docPr id="1" name="Afbeelding 1" descr="Leerkwartier-logo"/>
@@ -144,10 +144,10 @@
                 <w:szCs w:val="22"/>
               </w:rPr>
               <w:drawing>
-                <wp:inline distT="0" distB="0" distL="0" distR="0" wp14:anchorId="612A79F0" wp14:editId="250E4AD8">
+                <wp:inline distT="0" distB="0" distL="0" distR="0" wp14:anchorId="2A6649BA" wp14:editId="7CC4242B">
                   <wp:extent cx="1428750" cy="947928"/>
                   <wp:effectExtent l="0" t="0" r="0" b="5080"/>
-                  <wp:docPr id="2" name="Afbeelding 2" descr="Logo Voedselbank Alkmaar"/>
+                  <wp:docPr id="2" name="Afbeelding 2" descr="Partner-logo"/>
                   <wp:cNvGraphicFramePr>
                     <a:graphicFrameLocks xmlns:a="http://schemas.openxmlformats.org/drawingml/2006/main" noChangeAspect="1"/>
                   </wp:cNvGraphicFramePr>
@@ -155,7 +155,7 @@
                     <a:graphicData uri="http://schemas.openxmlformats.org/drawingml/2006/picture">
                       <pic:pic xmlns:pic="http://schemas.openxmlformats.org/drawingml/2006/picture">
                         <pic:nvPicPr>
-                          <pic:cNvPr id="0" name="Picture 2" descr="Logo Voedselbank Alkmaar"/>
+                          <pic:cNvPr id="0" name="Picture 2" descr="Partner-logo"/>
                           <pic:cNvPicPr>
                             <a:picLocks noChangeAspect="1" noChangeArrowheads="1"/>
                           </pic:cNvPicPr>
@@ -249,16 +249,8 @@
       <w:r>
         <w:rPr>
           <w:rFonts w:ascii="Arial" w:hAnsi="Arial" w:cs="Arial"/>
-          <w:b/>
-          <w:bCs/>
-        </w:rPr>
-        <w:t>Daarom is er Leerkwartier.</w:t>
-      </w:r>
-      <w:r>
-        <w:rPr>
-          <w:rFonts w:ascii="Arial" w:hAnsi="Arial" w:cs="Arial"/>
-        </w:rPr>
-        <w:t xml:space="preserve"> Een app waar uw kind gratis kan oefenen. Elke dag een kwartier is genoeg.</w:t>
+        </w:rPr>
+        <w:t>&lt;strong&gt;Daarom is er Leerkwartier.&lt;/strong&gt; Een app waar uw kind gratis kan oefenen. Elke dag een kwartier is genoeg.</w:t>
       </w:r>
     </w:p>
     <w:tbl>
@@ -317,10 +309,10 @@
                 <w:szCs w:val="22"/>
               </w:rPr>
               <w:drawing>
-                <wp:inline distT="0" distB="0" distL="0" distR="0" wp14:anchorId="27444ECE" wp14:editId="2F6732A2">
+                <wp:inline distT="0" distB="0" distL="0" distR="0" wp14:anchorId="4822245F" wp14:editId="6262A0EA">
                   <wp:extent cx="1092200" cy="1092200"/>
                   <wp:effectExtent l="0" t="0" r="0" b="0"/>
-                  <wp:docPr id="3" name="Afbeelding 3" descr="QR-code naar leerkwartier.app"/>
+                  <wp:docPr id="3" name="Afbeelding 3" descr="QR-code"/>
                   <wp:cNvGraphicFramePr>
                     <a:graphicFrameLocks xmlns:a="http://schemas.openxmlformats.org/drawingml/2006/main" noChangeAspect="1"/>
                   </wp:cNvGraphicFramePr>
@@ -328,7 +320,7 @@
                     <a:graphicData uri="http://schemas.openxmlformats.org/drawingml/2006/picture">
                       <pic:pic xmlns:pic="http://schemas.openxmlformats.org/drawingml/2006/picture">
                         <pic:nvPicPr>
-                          <pic:cNvPr id="0" name="Picture 3" descr="QR-code naar leerkwartier.app"/>
+                          <pic:cNvPr id="0" name="Picture 3" descr="QR-code"/>
                           <pic:cNvPicPr>
                             <a:picLocks noChangeAspect="1" noChangeArrowheads="1"/>
                           </pic:cNvPicPr>
@@ -432,16 +424,8 @@
             <w:r>
               <w:rPr>
                 <w:rFonts w:ascii="Arial" w:hAnsi="Arial" w:cs="Arial"/>
-                <w:b/>
-                <w:bCs/>
-              </w:rPr>
-              <w:t>Richt de camera van uw telefoon op deze code.</w:t>
-            </w:r>
-            <w:r>
-              <w:rPr>
-                <w:rFonts w:ascii="Arial" w:hAnsi="Arial" w:cs="Arial"/>
-              </w:rPr>
-              <w:t xml:space="preserve"> </w:t>
+              </w:rPr>
+              <w:t xml:space="preserve">&lt;strong&gt;Richt de camera van uw telefoon op deze code.&lt;/strong&gt; </w:t>
             </w:r>
             <w:r>
               <w:rPr>
@@ -461,66 +445,21 @@
               <w:rPr>
                 <w:rFonts w:ascii="Arial" w:hAnsi="Arial" w:cs="Arial"/>
               </w:rPr>
-              <w:t xml:space="preserve">Uw code </w:t>
-            </w:r>
-            <w:r>
-              <w:rPr>
-                <w:rStyle w:val="badge1"/>
-                <w:rFonts w:ascii="Arial" w:hAnsi="Arial" w:cs="Arial"/>
-              </w:rPr>
-              <w:t>ALKMAAR2027</w:t>
-            </w:r>
-            <w:r>
-              <w:rPr>
-                <w:rFonts w:ascii="Arial" w:hAnsi="Arial" w:cs="Arial"/>
-              </w:rPr>
-              <w:t xml:space="preserve"> doet automatisch mee. Daarmee blijft de app voor uw gezin </w:t>
-            </w:r>
-            <w:r>
-              <w:rPr>
-                <w:rFonts w:ascii="Arial" w:hAnsi="Arial" w:cs="Arial"/>
-                <w:b/>
-                <w:bCs/>
-              </w:rPr>
-              <w:t>gratis tot en met de Doorstroomtoets van 2027</w:t>
-            </w:r>
-            <w:r>
-              <w:rPr>
-                <w:rFonts w:ascii="Arial" w:hAnsi="Arial" w:cs="Arial"/>
-              </w:rPr>
-              <w:t>.</w:t>
+              <w:t>Uw code &lt;span class="qr-code-badge"&gt;ALKMAAR2027&lt;/span&gt; doet automatisch mee. Daarmee blijft de app voor uw gezin &lt;strong&gt;gratis tot en met de Doorstroomtoets van 2027&lt;/strong&gt;.</w:t>
             </w:r>
           </w:p>
           <w:p>
             <w:pPr>
               <w:pStyle w:val="Normaalweb"/>
-              <w:spacing w:after="0"/>
               <w:rPr>
                 <w:rFonts w:ascii="Arial" w:hAnsi="Arial" w:cs="Arial"/>
-                <w:color w:val="8893A3"/>
-                <w:sz w:val="18"/>
-                <w:szCs w:val="18"/>
               </w:rPr>
             </w:pPr>
             <w:r>
               <w:rPr>
                 <w:rFonts w:ascii="Arial" w:hAnsi="Arial" w:cs="Arial"/>
-                <w:color w:val="8893A3"/>
-                <w:sz w:val="18"/>
-                <w:szCs w:val="18"/>
-              </w:rPr>
-              <w:t xml:space="preserve">Lukt het scannen niet? Typ dan in de browser: </w:t>
-            </w:r>
-            <w:r>
-              <w:rPr>
-                <w:rFonts w:ascii="Arial" w:hAnsi="Arial" w:cs="Arial"/>
-                <w:b/>
-                <w:bCs/>
-                <w:color w:val="8893A3"/>
-                <w:sz w:val="18"/>
-                <w:szCs w:val="18"/>
-              </w:rPr>
-              <w:t>leerkwartier.app/?partner=ALKMAAR2027</w:t>
+              </w:rPr>
+              <w:t>Lukt het scannen niet? Typ dan in de browser:&lt;br&gt;&lt;strong style="white-space:nowrap"&gt;leerkwartier.app/?partner=ALKMAAR2027&lt;/strong&gt;</w:t>
             </w:r>
           </w:p>
         </w:tc>
@@ -558,21 +497,13 @@
         <w:rPr>
           <w:rFonts w:ascii="Arial" w:hAnsi="Arial" w:cs="Arial"/>
         </w:rPr>
-        <w:t xml:space="preserve"> Een </w:t>
-      </w:r>
-      <w:r>
-        <w:rPr>
-          <w:rFonts w:ascii="Arial" w:hAnsi="Arial" w:cs="Arial"/>
-          <w:b/>
-          <w:bCs/>
-        </w:rPr>
-        <w:t>oefen-toets</w:t>
-      </w:r>
-      <w:r>
-        <w:rPr>
-          <w:rFonts w:ascii="Arial" w:hAnsi="Arial" w:cs="Arial"/>
-        </w:rPr>
-        <w:t xml:space="preserve"> maken. Die lijkt op de echte Doorstroomtoets.</w:t>
+        <w:t xml:space="preserve"> Een &lt;strong&gt;oefen-toets&lt;/strong&gt; </w:t>
+      </w:r>
+      <w:r>
+        <w:rPr>
+          <w:rFonts w:ascii="Arial" w:hAnsi="Arial" w:cs="Arial"/>
+        </w:rPr>
+        <w:t>maken. Die lijkt op de echte Doorstroomtoets.</w:t>
       </w:r>
       <w:r>
         <w:rPr>
@@ -591,21 +522,7 @@
         <w:rPr>
           <w:rFonts w:ascii="Arial" w:hAnsi="Arial" w:cs="Arial"/>
         </w:rPr>
-        <w:t xml:space="preserve"> Elke dag een </w:t>
-      </w:r>
-      <w:r>
-        <w:rPr>
-          <w:rFonts w:ascii="Arial" w:hAnsi="Arial" w:cs="Arial"/>
-          <w:b/>
-          <w:bCs/>
-        </w:rPr>
-        <w:t>nieuwe vraag</w:t>
-      </w:r>
-      <w:r>
-        <w:rPr>
-          <w:rFonts w:ascii="Arial" w:hAnsi="Arial" w:cs="Arial"/>
-        </w:rPr>
-        <w:t xml:space="preserve"> oefenen. Met uitleg.</w:t>
+        <w:t xml:space="preserve"> Elke dag een &lt;strong&gt;nieuwe vraag&lt;/strong&gt; oefenen. Met uitleg.</w:t>
       </w:r>
       <w:r>
         <w:rPr>
@@ -624,21 +541,7 @@
         <w:rPr>
           <w:rFonts w:ascii="Arial" w:hAnsi="Arial" w:cs="Arial"/>
         </w:rPr>
-        <w:t xml:space="preserve"> Snapt uw kind iets niet? De app </w:t>
-      </w:r>
-      <w:r>
-        <w:rPr>
-          <w:rFonts w:ascii="Arial" w:hAnsi="Arial" w:cs="Arial"/>
-          <w:b/>
-          <w:bCs/>
-        </w:rPr>
-        <w:t>legt het uit</w:t>
-      </w:r>
-      <w:r>
-        <w:rPr>
-          <w:rFonts w:ascii="Arial" w:hAnsi="Arial" w:cs="Arial"/>
-        </w:rPr>
-        <w:t>. In makkelijke woorden. Net zo lang tot het lukt.</w:t>
+        <w:t xml:space="preserve"> Snapt uw kind iets niet? De app &lt;strong&gt;legt het uit&lt;/strong&gt;. In makkelijke woorden. Net zo lang tot het lukt.</w:t>
       </w:r>
       <w:r>
         <w:rPr>
@@ -657,21 +560,7 @@
         <w:rPr>
           <w:rFonts w:ascii="Arial" w:hAnsi="Arial" w:cs="Arial"/>
         </w:rPr>
-        <w:t xml:space="preserve"> Ook </w:t>
-      </w:r>
-      <w:r>
-        <w:rPr>
-          <w:rFonts w:ascii="Arial" w:hAnsi="Arial" w:cs="Arial"/>
-          <w:b/>
-          <w:bCs/>
-        </w:rPr>
-        <w:t>werkbladen om te printen</w:t>
-      </w:r>
-      <w:r>
-        <w:rPr>
-          <w:rFonts w:ascii="Arial" w:hAnsi="Arial" w:cs="Arial"/>
-        </w:rPr>
-        <w:t>. Handig als internet thuis niet goed werkt.</w:t>
+        <w:t xml:space="preserve"> Ook &lt;strong&gt;werkbladen om te printen&lt;/strong&gt;. Handig als internet thuis niet goed werkt.</w:t>
       </w:r>
     </w:p>
     <w:p>
@@ -803,10 +692,10 @@
                 <w:szCs w:val="22"/>
               </w:rPr>
               <w:drawing>
-                <wp:inline distT="0" distB="0" distL="0" distR="0" wp14:anchorId="66994DAE" wp14:editId="13B8B0E6">
+                <wp:inline distT="0" distB="0" distL="0" distR="0" wp14:anchorId="2B1661B3" wp14:editId="58E19D76">
                   <wp:extent cx="901700" cy="947928"/>
                   <wp:effectExtent l="0" t="0" r="0" b="5080"/>
-                  <wp:docPr id="4" name="Afbeelding 4" descr="Logo Voedselbank Alkmaar"/>
+                  <wp:docPr id="4" name="Afbeelding 4" descr="Partner-logo"/>
                   <wp:cNvGraphicFramePr>
                     <a:graphicFrameLocks xmlns:a="http://schemas.openxmlformats.org/drawingml/2006/main" noChangeAspect="1"/>
                   </wp:cNvGraphicFramePr>
@@ -814,7 +703,7 @@
                     <a:graphicData uri="http://schemas.openxmlformats.org/drawingml/2006/picture">
                       <pic:pic xmlns:pic="http://schemas.openxmlformats.org/drawingml/2006/picture">
                         <pic:nvPicPr>
-                          <pic:cNvPr id="0" name="Picture 4" descr="Logo Voedselbank Alkmaar"/>
+                          <pic:cNvPr id="0" name="Picture 4" descr="Partner-logo"/>
                           <pic:cNvPicPr>
                             <a:picLocks noChangeAspect="1" noChangeArrowheads="1"/>
                           </pic:cNvPicPr>
@@ -883,22 +772,8 @@
             <w:r>
               <w:rPr>
                 <w:rFonts w:ascii="Arial" w:hAnsi="Arial" w:cs="Arial"/>
-                <w:b/>
-                <w:bCs/>
-              </w:rPr>
-              <w:t>Voedselbank Alkmaar staat achter deze app.</w:t>
-            </w:r>
-            <w:r>
-              <w:rPr>
-                <w:rFonts w:ascii="Arial" w:hAnsi="Arial" w:cs="Arial"/>
-              </w:rPr>
-              <w:t xml:space="preserve"> </w:t>
-            </w:r>
-            <w:r>
-              <w:rPr>
-                <w:rFonts w:ascii="Arial" w:hAnsi="Arial" w:cs="Arial"/>
-              </w:rPr>
-              <w:t>U krijgt deze flyer van ons. Het aanbod is echt gratis voor u.</w:t>
+              </w:rPr>
+              <w:t>&lt;strong&gt;Voedselbank Alkmaar staat achter deze app.&lt;/strong&gt; U krijgt deze flyer van ons. Het aanbod is echt gratis voor u.</w:t>
             </w:r>
           </w:p>
         </w:tc>
@@ -1590,20 +1465,6 @@
       <w:szCs w:val="17"/>
     </w:rPr>
   </w:style>
-  <w:style w:type="paragraph" w:customStyle="1" w:styleId="badge">
-    <w:name w:val="badge"/>
-    <w:basedOn w:val="Standaard"/>
-    <w:pPr>
-      <w:shd w:val="clear" w:color="auto" w:fill="8A6400"/>
-      <w:spacing w:before="100" w:beforeAutospacing="1" w:after="100" w:afterAutospacing="1"/>
-    </w:pPr>
-    <w:rPr>
-      <w:b/>
-      <w:bCs/>
-      <w:color w:val="FFFFFF"/>
-      <w:spacing w:val="20"/>
-    </w:rPr>
-  </w:style>
   <w:style w:type="character" w:customStyle="1" w:styleId="naam1">
     <w:name w:val="naam1"/>
     <w:basedOn w:val="Standaardalinea-lettertype"/>
@@ -1613,17 +1474,6 @@
       <w:color w:val="0A7D43"/>
       <w:sz w:val="40"/>
       <w:szCs w:val="40"/>
-    </w:rPr>
-  </w:style>
-  <w:style w:type="character" w:customStyle="1" w:styleId="badge1">
-    <w:name w:val="badge1"/>
-    <w:basedOn w:val="Standaardalinea-lettertype"/>
-    <w:rPr>
-      <w:b/>
-      <w:bCs/>
-      <w:color w:val="FFFFFF"/>
-      <w:spacing w:val="20"/>
-      <w:shd w:val="clear" w:color="auto" w:fill="8A6400"/>
     </w:rPr>
   </w:style>
   <w:style w:type="character" w:customStyle="1" w:styleId="vink1">

</xml_diff>